<commit_message>
fix: rewrite all resumes with 100% honest content - no fabricated skills or inflated numbers
</commit_message>
<xml_diff>
--- a/Resume/Navneet_Vishwakarma_DevOps_Capgemini.docx
+++ b/Resume/Navneet_Vishwakarma_DevOps_Capgemini.docx
@@ -31,7 +31,7 @@
           <w:color w:val="555555"/>
           <w:sz w:val="17"/>
         </w:rPr>
-        <w:t>DevOps Engineer  |  SRE  |  CI/CD  |  Kubernetes  |  Infrastructure Automation</w:t>
+        <w:t>Linux Administrator  |  DevOps Engineer  |  CI/CD  |  Ansible  |  Docker</w:t>
       </w:r>
     </w:p>
     <w:p>
@@ -139,7 +139,7 @@
           <w:color w:val="2D2D2D"/>
           <w:sz w:val="17"/>
         </w:rPr>
-        <w:t>DevOps Engineer with hands-on experience in CI/CD pipeline management, infrastructure automation, system reliability, and incident support across Linux-based production environments. Proficient in Docker containerization, Kubernetes orchestration, Infrastructure as Code (Ansible, Terraform), Bash scripting, and Git-based workflows. Skilled in building monitoring and observability dashboards, executing reliability practices including health checks and rollout coordination, and troubleshooting platform issues to maintain uptime and performance. Experienced in SRE principles, log analysis, Root Cause Analysis (RCA), and automating routine operational tasks. Holds a B.Tech in Computer Science and seeks a DevOps/SRE role to contribute to platform reliability, continuous delivery, and infrastructure operations at scale.</w:t>
+        <w:t>Linux Administrator and aspiring DevOps Engineer with hands-on experience managing Linux servers (SLES, Ubuntu), deploying Docker containers, building CI/CD pipelines using GitHub Actions, and automating infrastructure with Ansible and Bash scripting. Experienced in server hardening, incident troubleshooting, log analysis, Root Cause Analysis (RCA), backup and recovery operations, and maintaining operational documentation. Familiar with Kubernetes fundamentals and KVM virtualization. Holds a B.Tech in Computer Science and is eager to contribute to platform reliability, continuous delivery, and infrastructure automation in a DevOps/SRE environment.</w:t>
       </w:r>
     </w:p>
     <w:p>
@@ -188,7 +188,7 @@
           <w:color w:val="2D2D2D"/>
           <w:sz w:val="17"/>
         </w:rPr>
-        <w:t>Git, GitHub, GitHub Actions, CI/CD Pipeline Design &amp; Maintenance, Automated Build/Deploy Workflows</w:t>
+        <w:t>GitHub Actions (Pipeline Build &amp; Maintenance), Git, GitHub</w:t>
       </w:r>
     </w:p>
     <w:p>
@@ -214,7 +214,7 @@
           <w:color w:val="2D2D2D"/>
           <w:sz w:val="17"/>
         </w:rPr>
-        <w:t>Docker (Build, Compose, Registry), Kubernetes (Pods, Deployments, Services, ConfigMaps, Helm)</w:t>
+        <w:t>Docker (Build, Compose, Deployment), Kubernetes (Basic: Pods, Deployments, kubectl)</w:t>
       </w:r>
     </w:p>
     <w:p>
@@ -240,33 +240,7 @@
           <w:color w:val="2D2D2D"/>
           <w:sz w:val="17"/>
         </w:rPr>
-        <w:t>Ansible (Playbooks, Roles, Handlers), Terraform, Bash Shell Scripting, Cron Automation</w:t>
-      </w:r>
-    </w:p>
-    <w:p>
-      <w:pPr>
-        <w:spacing w:before="10" w:after="10" w:line="210" w:lineRule="exact"/>
-        <w:ind w:left="144"/>
-      </w:pPr>
-      <w:r>
-        <w:rPr>
-          <w:rFonts w:ascii="Calibri" w:hAnsi="Calibri"/>
-          <w:b/>
-          <w:i w:val="0"/>
-          <w:color w:val="1A1A2E"/>
-          <w:sz w:val="17"/>
-        </w:rPr>
-        <w:t xml:space="preserve">Monitoring &amp; Observability:  </w:t>
-      </w:r>
-      <w:r>
-        <w:rPr>
-          <w:rFonts w:ascii="Calibri" w:hAnsi="Calibri"/>
-          <w:b w:val="0"/>
-          <w:i w:val="0"/>
-          <w:color w:val="2D2D2D"/>
-          <w:sz w:val="17"/>
-        </w:rPr>
-        <w:t>Prometheus, Grafana Dashboards, Log Analysis (journalctl, /var/log), Alerting, Health Checks</w:t>
+        <w:t>Ansible (Playbooks, Roles, Handlers), Bash Shell Scripting, Cron Scheduling</w:t>
       </w:r>
     </w:p>
     <w:p>
@@ -292,7 +266,7 @@
           <w:color w:val="2D2D2D"/>
           <w:sz w:val="17"/>
         </w:rPr>
-        <w:t>SUSE Linux Enterprise Server (SLES), Red Hat Enterprise Linux (RHEL), Ubuntu Server, openSUSE</w:t>
+        <w:t>SUSE Linux Enterprise Server (SLES), Ubuntu Server, openSUSE Leap</w:t>
       </w:r>
     </w:p>
     <w:p>
@@ -308,7 +282,7 @@
           <w:color w:val="1A1A2E"/>
           <w:sz w:val="17"/>
         </w:rPr>
-        <w:t xml:space="preserve">Cloud &amp; Virtualization:  </w:t>
+        <w:t xml:space="preserve">Virtualization:  </w:t>
       </w:r>
       <w:r>
         <w:rPr>
@@ -318,7 +292,7 @@
           <w:color w:val="2D2D2D"/>
           <w:sz w:val="17"/>
         </w:rPr>
-        <w:t>VMware ESXi, KVM, Cloud Infrastructure Operations</w:t>
+        <w:t>KVM</w:t>
       </w:r>
     </w:p>
     <w:p>
@@ -334,7 +308,7 @@
           <w:color w:val="1A1A2E"/>
           <w:sz w:val="17"/>
         </w:rPr>
-        <w:t xml:space="preserve">SRE &amp; Incident Mgmt:  </w:t>
+        <w:t xml:space="preserve">Linux Administration:  </w:t>
       </w:r>
       <w:r>
         <w:rPr>
@@ -344,7 +318,33 @@
           <w:color w:val="2D2D2D"/>
           <w:sz w:val="17"/>
         </w:rPr>
-        <w:t>Incident Support, Root Cause Analysis (RCA), Rollout Coordination, Reliability Automation, Uptime &amp; Performance Monitoring, Runbooks/SOPs</w:t>
+        <w:t>User &amp; Group Mgmt, File Systems, Package Mgmt (zypper, apt), Service Control (systemd), SSH Hardening, Firewall (firewalld, UFW), auditd, Log Analysis (journalctl, /var/log)</w:t>
+      </w:r>
+    </w:p>
+    <w:p>
+      <w:pPr>
+        <w:spacing w:before="10" w:after="10" w:line="210" w:lineRule="exact"/>
+        <w:ind w:left="144"/>
+      </w:pPr>
+      <w:r>
+        <w:rPr>
+          <w:rFonts w:ascii="Calibri" w:hAnsi="Calibri"/>
+          <w:b/>
+          <w:i w:val="0"/>
+          <w:color w:val="1A1A2E"/>
+          <w:sz w:val="17"/>
+        </w:rPr>
+        <w:t xml:space="preserve">Incident &amp; Reliability:  </w:t>
+      </w:r>
+      <w:r>
+        <w:rPr>
+          <w:rFonts w:ascii="Calibri" w:hAnsi="Calibri"/>
+          <w:b w:val="0"/>
+          <w:i w:val="0"/>
+          <w:color w:val="2D2D2D"/>
+          <w:sz w:val="17"/>
+        </w:rPr>
+        <w:t>Incident Troubleshooting, Root Cause Analysis (RCA), Backup &amp; Recovery, Uptime Monitoring, Runbooks/SOPs</w:t>
       </w:r>
     </w:p>
     <w:p>
@@ -370,7 +370,7 @@
           <w:color w:val="2D2D2D"/>
           <w:sz w:val="17"/>
         </w:rPr>
-        <w:t>TCP/IP, DNS, DHCP, SSH, HTTP/HTTPS, Firewall (firewalld, UFW), Network Troubleshooting</w:t>
+        <w:t>TCP/IP, DNS, DHCP, SSH, HTTP/HTTPS, Network Troubleshooting</w:t>
       </w:r>
     </w:p>
     <w:p>
@@ -408,7 +408,7 @@
           <w:color w:val="1A1A2E"/>
           <w:sz w:val="19"/>
         </w:rPr>
-        <w:t>Linux System Administrator / DevOps Engineer</w:t>
+        <w:t>Linux System Administrator</w:t>
       </w:r>
     </w:p>
     <w:p>
@@ -459,7 +459,7 @@
           <w:color w:val="2D2D2D"/>
           <w:sz w:val="17"/>
         </w:rPr>
-        <w:t>Maintained and improved CI/CD pipelines using GitHub Actions for automated build, test, and deployment workflows across multiple application environments, reducing release cycles by 30%.</w:t>
+        <w:t>Manage 5 Linux servers (SLES, Ubuntu) across production and staging environments, handling server provisioning, updates, and day-to-day infrastructure operations.</w:t>
       </w:r>
     </w:p>
     <w:p>
@@ -485,7 +485,7 @@
           <w:color w:val="2D2D2D"/>
           <w:sz w:val="17"/>
         </w:rPr>
-        <w:t>Deployed and managed Docker-based containerized application stacks; orchestrated container lifecycle, image builds, and multi-service compositions using Docker Compose.</w:t>
+        <w:t>Built and maintain CI/CD pipelines using GitHub Actions for automated build and deployment workflows of web applications.</w:t>
       </w:r>
     </w:p>
     <w:p>
@@ -511,7 +511,7 @@
           <w:color w:val="2D2D2D"/>
           <w:sz w:val="17"/>
         </w:rPr>
-        <w:t>Supported infrastructure operations across 10+ Linux servers (SLES 15, Ubuntu 22.04) focused on uptime and performance, maintaining 99.5% service availability.</w:t>
+        <w:t>Deploy and manage Docker-based containerized application stacks, handling container lifecycle, image builds, and multi-service compositions.</w:t>
       </w:r>
     </w:p>
     <w:p>
@@ -537,7 +537,7 @@
           <w:color w:val="2D2D2D"/>
           <w:sz w:val="17"/>
         </w:rPr>
-        <w:t>Built monitoring and observability dashboards using Prometheus and Grafana; configured alerting rules and health checks to proactively identify incidents before user impact.</w:t>
+        <w:t>Troubleshoot and resolve production incidents through systematic log analysis (journalctl, /var/log/messages) and root cause investigation; resolved 15+ operational issues since joining.</w:t>
       </w:r>
     </w:p>
     <w:p>
@@ -563,7 +563,7 @@
           <w:color w:val="2D2D2D"/>
           <w:sz w:val="17"/>
         </w:rPr>
-        <w:t>Executed reliability practices including health checks, staged rollouts, and incident support; resolved 50+ production incidents through systematic log analysis and root cause investigation.</w:t>
+        <w:t>Automate routine server administration tasks using Ansible playbooks and Bash scripts, covering user provisioning, package updates, and configuration management.</w:t>
       </w:r>
     </w:p>
     <w:p>
@@ -589,7 +589,7 @@
           <w:color w:val="2D2D2D"/>
           <w:sz w:val="17"/>
         </w:rPr>
-        <w:t>Automated routine infrastructure tasks using Ansible playbooks and Bash scripts, eliminating 40% of manual operational effort and reducing configuration drift.</w:t>
+        <w:t>Implement server hardening measures: SSH key-based authentication, firewall rules (firewalld/UFW), audit logging (auditd), and service lockdown following security best practices.</w:t>
       </w:r>
     </w:p>
     <w:p>
@@ -615,7 +615,7 @@
           <w:color w:val="2D2D2D"/>
           <w:sz w:val="17"/>
         </w:rPr>
-        <w:t>Implemented server hardening aligned with CIS/NIST baselines: SSH security, firewall rules (firewalld/UFW), audit logging (auditd), and automated patch management.</w:t>
+        <w:t>Manage backup and recovery operations for application data and server configurations to ensure data protection and restoration readiness.</w:t>
       </w:r>
     </w:p>
     <w:p>
@@ -641,7 +641,7 @@
           <w:color w:val="2D2D2D"/>
           <w:sz w:val="17"/>
         </w:rPr>
-        <w:t>Created and maintained operational documentation including runbooks, SOPs, and incident reports to ensure repeatable processes and knowledge transfer across teams.</w:t>
+        <w:t>Maintain operational documentation including runbooks, SOPs, and incident reports for team knowledge sharing and repeatable processes.</w:t>
       </w:r>
     </w:p>
     <w:p>
@@ -725,7 +725,7 @@
           <w:color w:val="2D2D2D"/>
           <w:sz w:val="17"/>
         </w:rPr>
-        <w:t>Built 6 Ansible roles as Infrastructure as Code (IaC) to automate SSH hardening, firewall enforcement, audit logging, legacy service removal, and compliance scanning across RHEL-family and SUSE targets.</w:t>
+        <w:t>Wrote 6 Ansible roles to automate SSH hardening, firewall enforcement, audit logging, legacy service removal, and compliance scanning across Ubuntu and openSUSE servers.</w:t>
       </w:r>
     </w:p>
     <w:p>
@@ -751,7 +751,7 @@
           <w:color w:val="2D2D2D"/>
           <w:sz w:val="17"/>
         </w:rPr>
-        <w:t>Implemented reliability automation: standardized server configurations, automated patch scheduling, and integrated Lynis auditing framework for continuous compliance verification.</w:t>
+        <w:t>Applied CIS/NIST-aligned security configurations: PAM password policies, persistent journald logging, and automated patch scheduling. Integrated Lynis for compliance verification.</w:t>
       </w:r>
     </w:p>
     <w:p>
@@ -812,7 +812,7 @@
           <w:color w:val="2D2D2D"/>
           <w:sz w:val="17"/>
         </w:rPr>
-        <w:t>Conducted enterprise-grade Root Cause Analysis on a P1 outage in a 2-node SLES HA cluster (Pacemaker/Corosync/SBD), troubleshooting cascading failures across networking, fencing, and watchdog layers that triggered a 5x reboot loop over 79 minutes.</w:t>
+        <w:t>Conducted Root Cause Analysis on a P1 outage in a 2-node SLES HA cluster (Pacemaker/Corosync/SBD), troubleshooting cascading failures across networking, fencing, and watchdog layers that triggered a 5x reboot loop.</w:t>
       </w:r>
     </w:p>
     <w:p>
@@ -838,7 +838,7 @@
           <w:color w:val="2D2D2D"/>
           <w:sz w:val="17"/>
         </w:rPr>
-        <w:t>Delivered detailed incident timeline, technical findings, and actionable remediation plan covering observability improvements, timeout tuning, and network redundancy recommendations.</w:t>
+        <w:t>Analyzed supportconfig archives and system logs to reconstruct event timeline; delivered incident report with actionable remediation steps.</w:t>
       </w:r>
     </w:p>
     <w:p>

</xml_diff>